<commit_message>
feat: add AI credit assessment API and update KHCN DOCX templates
</commit_message>
<xml_diff>
--- a/report_assets/KHCN templates/Báo cáo đề xuất/2268.02C BCDXCV trung, dai han nha kinh.docx
+++ b/report_assets/KHCN templates/Báo cáo đề xuất/2268.02C BCDXCV trung, dai han nha kinh.docx
@@ -105,7 +105,7 @@
                 </mc:Choice>
                 <mc:Fallback>
                   <w:pict>
-                    <v:line w14:anchorId="5C632130" id="Straight Connector 6" o:spid="_x0000_s1026" style="position:absolute;z-index:251704320;visibility:visible;mso-wrap-style:square;mso-wrap-distance-left:9pt;mso-wrap-distance-top:0;mso-wrap-distance-right:9pt;mso-wrap-distance-bottom:0;mso-position-horizontal:center;mso-position-horizontal-relative:margin;mso-position-vertical:absolute;mso-position-vertical-relative:text" from="0,16.5pt" to="108pt,16.5pt" o:gfxdata="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">
+                    <v:line w14:anchorId="5142133A" id="Straight Connector 6" o:spid="_x0000_s1026" style="position:absolute;z-index:251704320;visibility:visible;mso-wrap-style:square;mso-wrap-distance-left:9pt;mso-wrap-distance-top:0;mso-wrap-distance-right:9pt;mso-wrap-distance-bottom:0;mso-position-horizontal:center;mso-position-horizontal-relative:margin;mso-position-vertical:absolute;mso-position-vertical-relative:text" from="0,16.5pt" to="108pt,16.5pt" o:gfxdata="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">
                       <w10:wrap anchorx="margin"/>
                     </v:line>
                   </w:pict>
@@ -257,7 +257,7 @@
                 </mc:Choice>
                 <mc:Fallback>
                   <w:pict>
-                    <v:shapetype w14:anchorId="409F32D8" id="_x0000_t32" coordsize="21600,21600" o:spt="32" o:oned="t" path="m,l21600,21600e" filled="f">
+                    <v:shapetype w14:anchorId="1650648E" id="_x0000_t32" coordsize="21600,21600" o:spt="32" o:oned="t" path="m,l21600,21600e" filled="f">
                       <v:path arrowok="t" fillok="f" o:connecttype="none"/>
                       <o:lock v:ext="edit" shapetype="t"/>
                     </v:shapetype>
@@ -4553,6 +4553,30 @@
           <w:rFonts w:ascii="Times New Roman" w:eastAsia="Calibri" w:hAnsi="Times New Roman" w:cs="Times New Roman"/>
           <w:sz w:val="26"/>
           <w:szCs w:val="28"/>
+        </w:rPr>
+        <w:t xml:space="preserve"> (theo hợp đồng thi công số [PA.Số HĐ thi công] ngày </w:t>
+      </w:r>
+      <w:r>
+        <w:rPr>
+          <w:rFonts w:ascii="Times New Roman" w:eastAsia="Calibri" w:hAnsi="Times New Roman" w:cs="Times New Roman"/>
+          <w:sz w:val="26"/>
+          <w:szCs w:val="28"/>
+        </w:rPr>
+        <w:t>[PA.Ngày HĐ thi công]</w:t>
+      </w:r>
+      <w:r>
+        <w:rPr>
+          <w:rFonts w:ascii="Times New Roman" w:eastAsia="Calibri" w:hAnsi="Times New Roman" w:cs="Times New Roman"/>
+          <w:sz w:val="26"/>
+          <w:szCs w:val="28"/>
+        </w:rPr>
+        <w:t xml:space="preserve"> và biên bản nghiệm thu)</w:t>
+      </w:r>
+      <w:r>
+        <w:rPr>
+          <w:rFonts w:ascii="Times New Roman" w:eastAsia="Calibri" w:hAnsi="Times New Roman" w:cs="Times New Roman"/>
+          <w:sz w:val="26"/>
+          <w:szCs w:val="28"/>
           <w:lang w:val="de-DE"/>
         </w:rPr>
         <w:t xml:space="preserve">, </w:t>
@@ -5464,6 +5488,7 @@
           <w:sz w:val="26"/>
           <w:szCs w:val="26"/>
         </w:rPr>
+        <w:lastRenderedPageBreak/>
         <w:t>- Diện tích: [Diện tích đất] m</w:t>
       </w:r>
       <w:r>
@@ -5503,7 +5528,6 @@
           <w:sz w:val="26"/>
           <w:szCs w:val="26"/>
         </w:rPr>
-        <w:lastRenderedPageBreak/>
         <w:t>- Hình thức sử dụng:  + Sử dụng riêng: [Sử dụng riêng] m</w:t>
       </w:r>
       <w:r>
@@ -7729,7 +7753,18 @@
           <w:szCs w:val="26"/>
           <w:lang w:val="fr-FR"/>
         </w:rPr>
-        <w:t xml:space="preserve"> [TV.Họ và tên]</w:t>
+        <w:t xml:space="preserve"> [TV.Họ </w:t>
+      </w:r>
+      <w:r>
+        <w:rPr>
+          <w:rFonts w:ascii="Times New Roman" w:eastAsia="Calibri" w:hAnsi="Times New Roman" w:cs="Times New Roman"/>
+          <w:bCs/>
+          <w:sz w:val="26"/>
+          <w:szCs w:val="26"/>
+          <w:lang w:val="fr-FR"/>
+        </w:rPr>
+        <w:lastRenderedPageBreak/>
+        <w:t>và tên]</w:t>
       </w:r>
       <w:r>
         <w:rPr>
@@ -7805,7 +7840,6 @@
           <w:szCs w:val="26"/>
           <w:lang w:val="fr-FR"/>
         </w:rPr>
-        <w:lastRenderedPageBreak/>
         <w:t>- Không giới hạn đối với các khoản lãi trong hạn, lãi quá hạn, các khoản phí và chi phí phát sinh khác liên quan (nếu có).</w:t>
       </w:r>
     </w:p>
@@ -9223,6 +9257,7 @@
           <w:szCs w:val="28"/>
           <w:lang w:val="de-DE"/>
         </w:rPr>
+        <w:lastRenderedPageBreak/>
         <w:t>3</w:t>
       </w:r>
       <w:r>
@@ -9273,7 +9308,6 @@
           <w:szCs w:val="28"/>
           <w:lang w:val="de-DE"/>
         </w:rPr>
-        <w:lastRenderedPageBreak/>
         <w:t xml:space="preserve">- Tổng nhu cầu vốn: </w:t>
       </w:r>
       <w:r>
@@ -9293,6 +9327,30 @@
           <w:lang w:val="vi-VN"/>
         </w:rPr>
         <w:t xml:space="preserve"> đồng</w:t>
+      </w:r>
+      <w:r>
+        <w:rPr>
+          <w:rFonts w:ascii="Times New Roman" w:eastAsia="Calibri" w:hAnsi="Times New Roman" w:cs="Times New Roman"/>
+          <w:sz w:val="26"/>
+          <w:szCs w:val="28"/>
+        </w:rPr>
+        <w:t xml:space="preserve"> (theo hợp đồng thi công số [PA.Số HĐ thi công] ngày </w:t>
+      </w:r>
+      <w:r>
+        <w:rPr>
+          <w:rFonts w:ascii="Times New Roman" w:eastAsia="Calibri" w:hAnsi="Times New Roman" w:cs="Times New Roman"/>
+          <w:sz w:val="26"/>
+          <w:szCs w:val="28"/>
+        </w:rPr>
+        <w:t>[PA.Ngày HĐ thi công]</w:t>
+      </w:r>
+      <w:r>
+        <w:rPr>
+          <w:rFonts w:ascii="Times New Roman" w:eastAsia="Calibri" w:hAnsi="Times New Roman" w:cs="Times New Roman"/>
+          <w:sz w:val="26"/>
+          <w:szCs w:val="28"/>
+        </w:rPr>
+        <w:t xml:space="preserve"> và biên bản nghiệm thu)</w:t>
       </w:r>
       <w:r>
         <w:rPr>
@@ -9411,7 +9469,7 @@
           <w:szCs w:val="28"/>
           <w:lang w:val="de-DE"/>
         </w:rPr>
-        <w:t>[PA.Tỷ lệ vốn đối ứng]%</w:t>
+        <w:t>[PA.Tỷ lệ vốn đối ứng]</w:t>
       </w:r>
     </w:p>
     <w:p>
@@ -12078,6 +12136,7 @@
                 <w:sz w:val="24"/>
                 <w:szCs w:val="24"/>
               </w:rPr>
+              <w:lastRenderedPageBreak/>
               <w:t>-</w:t>
             </w:r>
           </w:p>
@@ -12522,7 +12581,6 @@
                 <w:sz w:val="24"/>
                 <w:szCs w:val="24"/>
               </w:rPr>
-              <w:lastRenderedPageBreak/>
               <w:t>-</w:t>
             </w:r>
           </w:p>
@@ -16724,6 +16782,7 @@
           <w:szCs w:val="28"/>
           <w:lang w:val="pt-BR"/>
         </w:rPr>
+        <w:lastRenderedPageBreak/>
         <w:t>-</w:t>
       </w:r>
       <w:r>
@@ -16852,7 +16911,6 @@
           <w:szCs w:val="28"/>
           <w:lang w:val="de-DE"/>
         </w:rPr>
-        <w:lastRenderedPageBreak/>
         <w:t xml:space="preserve">* </w:t>
       </w:r>
       <w:r>
@@ -18254,6 +18312,7 @@
           <w:szCs w:val="28"/>
           <w:lang w:val="pt-BR"/>
         </w:rPr>
+        <w:lastRenderedPageBreak/>
         <w:t>Trên cơ sở hồ sơ vay vốn, đề xuất của Người quan hệ khách hàng, Người thẩm định đã tiến hành thẩm định và đề xuất như sau:</w:t>
       </w:r>
     </w:p>
@@ -18304,7 +18363,6 @@
           <w:szCs w:val="28"/>
           <w:lang w:val="pt-BR"/>
         </w:rPr>
-        <w:lastRenderedPageBreak/>
         <w:t xml:space="preserve">- Số tiền cho vay: </w:t>
       </w:r>
       <w:r>
@@ -18425,14 +18483,6 @@
       </w:r>
       <w:r>
         <w:rPr>
-          <w:rFonts w:ascii="Times New Roman" w:eastAsia="Calibri" w:hAnsi="Times New Roman" w:cs="Times New Roman"/>
-          <w:sz w:val="26"/>
-          <w:szCs w:val="26"/>
-        </w:rPr>
-        <w:t xml:space="preserve"> tháng</w:t>
-      </w:r>
-      <w:r>
-        <w:rPr>
           <w:rFonts w:ascii="Times New Roman" w:eastAsia="Times New Roman" w:hAnsi="Times New Roman" w:cs="Times New Roman"/>
           <w:sz w:val="26"/>
           <w:szCs w:val="28"/>
@@ -18498,7 +18548,43 @@
           <w:szCs w:val="28"/>
           <w:lang w:val="pt-BR"/>
         </w:rPr>
-        <w:t xml:space="preserve">- Lãi suất vay: [HĐTD.Lãi suất vay]. Lãi suất quá hạn: [HĐTD.Lãi suất quá hạn]. Lãi chậm trả lãi: [HĐTD.Lãi suất chậm trả]; </w:t>
+        <w:t xml:space="preserve">- Lãi suất vay: [HĐTD.Lãi suất vay]. Lãi suất quá hạn: </w:t>
+      </w:r>
+      <w:r>
+        <w:rPr>
+          <w:rFonts w:ascii="Times New Roman" w:eastAsia="Times New Roman" w:hAnsi="Times New Roman" w:cs="Times New Roman"/>
+          <w:sz w:val="26"/>
+          <w:szCs w:val="28"/>
+          <w:lang w:val="pt-BR"/>
+        </w:rPr>
+        <w:t>bằng 150% lãi suất trong hạn</w:t>
+      </w:r>
+      <w:r>
+        <w:rPr>
+          <w:rFonts w:ascii="Times New Roman" w:eastAsia="Times New Roman" w:hAnsi="Times New Roman" w:cs="Times New Roman"/>
+          <w:sz w:val="26"/>
+          <w:szCs w:val="28"/>
+          <w:lang w:val="pt-BR"/>
+        </w:rPr>
+        <w:t xml:space="preserve">. Lãi chậm trả lãi: </w:t>
+      </w:r>
+      <w:r>
+        <w:rPr>
+          <w:rFonts w:ascii="Times New Roman" w:eastAsia="Times New Roman" w:hAnsi="Times New Roman" w:cs="Times New Roman"/>
+          <w:sz w:val="26"/>
+          <w:szCs w:val="28"/>
+          <w:lang w:val="pt-BR"/>
+        </w:rPr>
+        <w:t>10%/năm</w:t>
+      </w:r>
+      <w:r>
+        <w:rPr>
+          <w:rFonts w:ascii="Times New Roman" w:eastAsia="Times New Roman" w:hAnsi="Times New Roman" w:cs="Times New Roman"/>
+          <w:sz w:val="26"/>
+          <w:szCs w:val="28"/>
+          <w:lang w:val="pt-BR"/>
+        </w:rPr>
+        <w:t xml:space="preserve">; </w:t>
       </w:r>
     </w:p>
     <w:p>
@@ -19207,6 +19293,7 @@
           <w:szCs w:val="28"/>
           <w:lang w:val="pt-BR"/>
         </w:rPr>
+        <w:lastRenderedPageBreak/>
         <w:t xml:space="preserve">- Thời hạn cho vay: </w:t>
       </w:r>
       <w:r>
@@ -19218,14 +19305,6 @@
           <w:lang w:val="pt-BR"/>
         </w:rPr>
         <w:t>[HĐTD.Thời hạn vay]</w:t>
-      </w:r>
-      <w:r>
-        <w:rPr>
-          <w:rFonts w:ascii="Times New Roman" w:eastAsia="Calibri" w:hAnsi="Times New Roman" w:cs="Times New Roman"/>
-          <w:sz w:val="26"/>
-          <w:szCs w:val="26"/>
-        </w:rPr>
-        <w:t xml:space="preserve"> tháng</w:t>
       </w:r>
       <w:r>
         <w:rPr>
@@ -19294,8 +19373,43 @@
           <w:szCs w:val="28"/>
           <w:lang w:val="pt-BR"/>
         </w:rPr>
-        <w:lastRenderedPageBreak/>
-        <w:t xml:space="preserve">- Lãi suất vay: [HĐTD.Lãi suất vay]. Lãi suất quá hạn: [HĐTD.Lãi suất quá hạn]. Lãi chậm trả lãi: [HĐTD.Lãi suất chậm trả]; </w:t>
+        <w:t xml:space="preserve">- Lãi suất vay: [HĐTD.Lãi suất vay]. Lãi suất quá hạn: </w:t>
+      </w:r>
+      <w:r>
+        <w:rPr>
+          <w:rFonts w:ascii="Times New Roman" w:eastAsia="Times New Roman" w:hAnsi="Times New Roman" w:cs="Times New Roman"/>
+          <w:sz w:val="26"/>
+          <w:szCs w:val="28"/>
+          <w:lang w:val="pt-BR"/>
+        </w:rPr>
+        <w:t>bằng 150% lãi suất trong hạn</w:t>
+      </w:r>
+      <w:r>
+        <w:rPr>
+          <w:rFonts w:ascii="Times New Roman" w:eastAsia="Times New Roman" w:hAnsi="Times New Roman" w:cs="Times New Roman"/>
+          <w:sz w:val="26"/>
+          <w:szCs w:val="28"/>
+          <w:lang w:val="pt-BR"/>
+        </w:rPr>
+        <w:t xml:space="preserve">. Lãi chậm trả lãi: </w:t>
+      </w:r>
+      <w:r>
+        <w:rPr>
+          <w:rFonts w:ascii="Times New Roman" w:eastAsia="Times New Roman" w:hAnsi="Times New Roman" w:cs="Times New Roman"/>
+          <w:sz w:val="26"/>
+          <w:szCs w:val="28"/>
+          <w:lang w:val="pt-BR"/>
+        </w:rPr>
+        <w:t>10%/năm</w:t>
+      </w:r>
+      <w:r>
+        <w:rPr>
+          <w:rFonts w:ascii="Times New Roman" w:eastAsia="Times New Roman" w:hAnsi="Times New Roman" w:cs="Times New Roman"/>
+          <w:sz w:val="26"/>
+          <w:szCs w:val="28"/>
+          <w:lang w:val="pt-BR"/>
+        </w:rPr>
+        <w:t xml:space="preserve">; </w:t>
       </w:r>
     </w:p>
     <w:p>

</xml_diff>